<commit_message>
feat: align courseware to three infographic topics
</commit_message>
<xml_diff>
--- a/courseware/LG-Create Powerpoint Infographics with AI.docx
+++ b/courseware/LG-Create Powerpoint Infographics with AI.docx
@@ -179,7 +179,7 @@
           <w:color w:val="1F6FEB"/>
           <w:sz w:val="24"/>
         </w:rPr>
-        <w:t>Version 5.0</w:t>
+        <w:t>Version 5.1</w:t>
       </w:r>
     </w:p>
     <w:p>
@@ -515,6 +515,64 @@
           </w:p>
         </w:tc>
       </w:tr>
+      <w:tr>
+        <w:tc>
+          <w:tcPr>
+            <w:tcW w:type="dxa" w:w="2160"/>
+          </w:tcPr>
+          <w:p>
+            <w:r/>
+            <w:r>
+              <w:rPr>
+                <w:sz w:val="19"/>
+              </w:rPr>
+              <w:t>5.1</w:t>
+            </w:r>
+          </w:p>
+        </w:tc>
+        <w:tc>
+          <w:tcPr>
+            <w:tcW w:type="dxa" w:w="2160"/>
+          </w:tcPr>
+          <w:p>
+            <w:r/>
+            <w:r>
+              <w:rPr>
+                <w:sz w:val="19"/>
+              </w:rPr>
+              <w:t>5 September 2026</w:t>
+            </w:r>
+          </w:p>
+        </w:tc>
+        <w:tc>
+          <w:tcPr>
+            <w:tcW w:type="dxa" w:w="2160"/>
+          </w:tcPr>
+          <w:p>
+            <w:r/>
+            <w:r>
+              <w:rPr>
+                <w:sz w:val="19"/>
+              </w:rPr>
+              <w:t>Aligned the Learner Guide and activities to the three approved topic titles; preserved Copilot prompts, PowerPoint procedures, demonstrations and verification controls.</w:t>
+            </w:r>
+          </w:p>
+        </w:tc>
+        <w:tc>
+          <w:tcPr>
+            <w:tcW w:type="dxa" w:w="2160"/>
+          </w:tcPr>
+          <w:p>
+            <w:r/>
+            <w:r>
+              <w:rPr>
+                <w:sz w:val="19"/>
+              </w:rPr>
+              <w:t>Tertiary Infotech Academy Pte Ltd</w:t>
+            </w:r>
+          </w:p>
+        </w:tc>
+      </w:tr>
     </w:tbl>
     <w:p>
       <w:r>
@@ -700,7 +758,7 @@
           <w:color w:val="333333"/>
           <w:sz w:val="22"/>
         </w:rPr>
-        <w:t>LU1 — Introduction to Infographics</w:t>
+        <w:t>LU1 — AI-Assisted Infographic Planning and Data Insights</w:t>
         <w:tab/>
         <w:t>9</w:t>
       </w:r>
@@ -759,7 +817,7 @@
           <w:color w:val="333333"/>
           <w:sz w:val="22"/>
         </w:rPr>
-        <w:t>LU2 — Create Infographics in PowerPoint</w:t>
+        <w:t>LU2 — Creating PowerPoint Infographics with AI</w:t>
         <w:tab/>
         <w:t>14</w:t>
       </w:r>
@@ -858,7 +916,7 @@
           <w:color w:val="333333"/>
           <w:sz w:val="22"/>
         </w:rPr>
-        <w:t>LU3 — Review Infographics</w:t>
+        <w:t>LU3 — Evaluating and Presenting Infographics for Business Impact</w:t>
         <w:tab/>
         <w:t>24</w:t>
       </w:r>
@@ -3027,7 +3085,7 @@
         <w:pStyle w:val="Heading1"/>
       </w:pPr>
       <w:r>
-        <w:t>LU1 — Introduction to Infographics</w:t>
+        <w:t>LU1 — AI-Assisted Infographic Planning and Data Insights</w:t>
       </w:r>
     </w:p>
     <w:p>
@@ -4197,7 +4255,7 @@
         <w:pStyle w:val="Heading1"/>
       </w:pPr>
       <w:r>
-        <w:t>LU2 — Create Infographics in PowerPoint</w:t>
+        <w:t>LU2 — Creating PowerPoint Infographics with AI</w:t>
       </w:r>
     </w:p>
     <w:p>
@@ -6517,7 +6575,7 @@
         <w:pStyle w:val="Heading1"/>
       </w:pPr>
       <w:r>
-        <w:t>LU3 — Review Infographics</w:t>
+        <w:t>LU3 — Evaluating and Presenting Infographics for Business Impact</w:t>
       </w:r>
     </w:p>
     <w:p>

</xml_diff>

<commit_message>
feat: add secure Microsoft 365 training access
</commit_message>
<xml_diff>
--- a/courseware/LG-Create Powerpoint Infographics with AI.docx
+++ b/courseware/LG-Create Powerpoint Infographics with AI.docx
@@ -179,7 +179,7 @@
           <w:color w:val="1F6FEB"/>
           <w:sz w:val="24"/>
         </w:rPr>
-        <w:t>Version 5.1</w:t>
+        <w:t>Version 5.2</w:t>
       </w:r>
     </w:p>
     <w:p>
@@ -573,6 +573,64 @@
           </w:p>
         </w:tc>
       </w:tr>
+      <w:tr>
+        <w:tc>
+          <w:tcPr>
+            <w:tcW w:type="dxa" w:w="2160"/>
+          </w:tcPr>
+          <w:p>
+            <w:r/>
+            <w:r>
+              <w:rPr>
+                <w:sz w:val="19"/>
+              </w:rPr>
+              <w:t>5.2</w:t>
+            </w:r>
+          </w:p>
+        </w:tc>
+        <w:tc>
+          <w:tcPr>
+            <w:tcW w:type="dxa" w:w="2160"/>
+          </w:tcPr>
+          <w:p>
+            <w:r/>
+            <w:r>
+              <w:rPr>
+                <w:sz w:val="19"/>
+              </w:rPr>
+              <w:t>5 September 2026</w:t>
+            </w:r>
+          </w:p>
+        </w:tc>
+        <w:tc>
+          <w:tcPr>
+            <w:tcW w:type="dxa" w:w="2160"/>
+          </w:tcPr>
+          <w:p>
+            <w:r/>
+            <w:r>
+              <w:rPr>
+                <w:sz w:val="19"/>
+              </w:rPr>
+              <w:t>Added secure Microsoft 365 Premium training-account access, Copilot infographic launch and sign-out guidance. Credentials remain trainer-issued and are not printed in learner materials.</w:t>
+            </w:r>
+          </w:p>
+        </w:tc>
+        <w:tc>
+          <w:tcPr>
+            <w:tcW w:type="dxa" w:w="2160"/>
+          </w:tcPr>
+          <w:p>
+            <w:r/>
+            <w:r>
+              <w:rPr>
+                <w:sz w:val="19"/>
+              </w:rPr>
+              <w:t>Tertiary Infotech Academy Pte Ltd</w:t>
+            </w:r>
+          </w:p>
+        </w:tc>
+      </w:tr>
     </w:tbl>
     <w:p>
       <w:r>
@@ -608,7 +666,27 @@
         </w:rPr>
         <w:t>How to Use This Guide</w:t>
         <w:tab/>
-        <w:t>4</w:t>
+        <w:t>5</w:t>
+      </w:r>
+    </w:p>
+    <w:p>
+      <w:pPr>
+        <w:tabs>
+          <w:tab w:pos="9072" w:val="right" w:leader="dot"/>
+        </w:tabs>
+        <w:spacing w:after="60"/>
+        <w:ind w:left="432"/>
+      </w:pPr>
+      <w:r>
+        <w:rPr>
+          <w:rFonts w:ascii="Arial" w:hAnsi="Arial"/>
+          <w:b w:val="0"/>
+          <w:color w:val="333333"/>
+          <w:sz w:val="21"/>
+        </w:rPr>
+        <w:t>Microsoft 365 Premium Training Account Access</w:t>
+        <w:tab/>
+        <w:t>5</w:t>
       </w:r>
     </w:p>
     <w:p>
@@ -627,7 +705,7 @@
         </w:rPr>
         <w:t>Learning Outcomes</w:t>
         <w:tab/>
-        <w:t>4</w:t>
+        <w:t>5</w:t>
       </w:r>
     </w:p>
     <w:p>
@@ -646,7 +724,7 @@
         </w:rPr>
         <w:t>Infographic Foundations</w:t>
         <w:tab/>
-        <w:t>4</w:t>
+        <w:t>6</w:t>
       </w:r>
     </w:p>
     <w:p>
@@ -665,7 +743,7 @@
         </w:rPr>
         <w:t>AI-First Data-to-Infographic Workflow</w:t>
         <w:tab/>
-        <w:t>5</w:t>
+        <w:t>6</w:t>
       </w:r>
     </w:p>
     <w:p>
@@ -684,7 +762,7 @@
         </w:rPr>
         <w:t>PowerPoint Design System</w:t>
         <w:tab/>
-        <w:t>6</w:t>
+        <w:t>8</w:t>
       </w:r>
     </w:p>
     <w:p>
@@ -703,7 +781,7 @@
         </w:rPr>
         <w:t>Microsoft 365 Copilot Infographic Creation</w:t>
         <w:tab/>
-        <w:t>7</w:t>
+        <w:t>8</w:t>
       </w:r>
     </w:p>
     <w:p>
@@ -722,7 +800,7 @@
         </w:rPr>
         <w:t>Workplace Infographic Demonstration Gallery</w:t>
         <w:tab/>
-        <w:t>8</w:t>
+        <w:t>10</w:t>
       </w:r>
     </w:p>
     <w:p>
@@ -741,7 +819,7 @@
         </w:rPr>
         <w:t>Review and Resource Decisions</w:t>
         <w:tab/>
-        <w:t>9</w:t>
+        <w:t>10</w:t>
       </w:r>
     </w:p>
     <w:p>
@@ -760,7 +838,7 @@
         </w:rPr>
         <w:t>LU1 — AI-Assisted Infographic Planning and Data Insights</w:t>
         <w:tab/>
-        <w:t>9</w:t>
+        <w:t>11</w:t>
       </w:r>
     </w:p>
     <w:p>
@@ -780,7 +858,7 @@
         </w:rPr>
         <w:t>Activity 1 — Interpret a Statistical KPI Infographic</w:t>
         <w:tab/>
-        <w:t>10</w:t>
+        <w:t>11</w:t>
       </w:r>
     </w:p>
     <w:p>
@@ -800,7 +878,7 @@
         </w:rPr>
         <w:t>Activity 2 — Design a Comparison Infographic Brief</w:t>
         <w:tab/>
-        <w:t>12</w:t>
+        <w:t>13</w:t>
       </w:r>
     </w:p>
     <w:p>
@@ -819,7 +897,7 @@
         </w:rPr>
         <w:t>LU2 — Creating PowerPoint Infographics with AI</w:t>
         <w:tab/>
-        <w:t>14</w:t>
+        <w:t>16</w:t>
       </w:r>
     </w:p>
     <w:p>
@@ -839,7 +917,7 @@
         </w:rPr>
         <w:t>Activity 3 — Create a Timeline Infographic with Microsoft 365 Copilot</w:t>
         <w:tab/>
-        <w:t>15</w:t>
+        <w:t>16</w:t>
       </w:r>
     </w:p>
     <w:p>
@@ -859,7 +937,7 @@
         </w:rPr>
         <w:t>Activity 4 — Create a Process Infographic with Microsoft 365 Copilot</w:t>
         <w:tab/>
-        <w:t>17</w:t>
+        <w:t>18</w:t>
       </w:r>
     </w:p>
     <w:p>
@@ -879,7 +957,7 @@
         </w:rPr>
         <w:t>Activity 5 — Create a Comparison Data Story with Copilot and PowerPoint</w:t>
         <w:tab/>
-        <w:t>19</w:t>
+        <w:t>21</w:t>
       </w:r>
     </w:p>
     <w:p>
@@ -899,7 +977,7 @@
         </w:rPr>
         <w:t>Activity 6 — Create a Hierarchy Infographic with Microsoft 365 Copilot</w:t>
         <w:tab/>
-        <w:t>22</w:t>
+        <w:t>23</w:t>
       </w:r>
     </w:p>
     <w:p>
@@ -918,7 +996,7 @@
         </w:rPr>
         <w:t>LU3 — Evaluating and Presenting Infographics for Business Impact</w:t>
         <w:tab/>
-        <w:t>24</w:t>
+        <w:t>25</w:t>
       </w:r>
     </w:p>
     <w:p>
@@ -938,7 +1016,7 @@
         </w:rPr>
         <w:t>Activity 7 — Create and Review a Stakeholder Mind Map Infographic</w:t>
         <w:tab/>
-        <w:t>24</w:t>
+        <w:t>26</w:t>
       </w:r>
     </w:p>
     <w:p>
@@ -958,7 +1036,7 @@
         </w:rPr>
         <w:t>Activity 8 — Create a Resource Scorecard Infographic</w:t>
         <w:tab/>
-        <w:t>27</w:t>
+        <w:t>28</w:t>
       </w:r>
     </w:p>
     <w:p>
@@ -977,7 +1055,7 @@
         </w:rPr>
         <w:t>Quick PowerPoint Reference</w:t>
         <w:tab/>
-        <w:t>29</w:t>
+        <w:t>30</w:t>
       </w:r>
     </w:p>
     <w:p>
@@ -996,7 +1074,7 @@
         </w:rPr>
         <w:t>Assessment</w:t>
         <w:tab/>
-        <w:t>29</w:t>
+        <w:t>31</w:t>
       </w:r>
     </w:p>
     <w:p>
@@ -1015,7 +1093,7 @@
         </w:rPr>
         <w:t>Assessment Flow</w:t>
         <w:tab/>
-        <w:t>29</w:t>
+        <w:t>31</w:t>
       </w:r>
     </w:p>
     <w:p>
@@ -1034,7 +1112,7 @@
         </w:rPr>
         <w:t>Sources and Further Reading</w:t>
         <w:tab/>
-        <w:t>30</w:t>
+        <w:t>31</w:t>
       </w:r>
     </w:p>
     <w:p>
@@ -1053,7 +1131,7 @@
         </w:rPr>
         <w:t>Support</w:t>
         <w:tab/>
-        <w:t>30</w:t>
+        <w:t>31</w:t>
       </w:r>
     </w:p>
     <w:p>
@@ -1114,6 +1192,67 @@
       </w:pPr>
       <w:r>
         <w:t>Keep the original evidence files unchanged; save a named working copy for each activity.</w:t>
+      </w:r>
+    </w:p>
+    <w:p>
+      <w:pPr>
+        <w:pStyle w:val="Heading2"/>
+      </w:pPr>
+      <w:r>
+        <w:t>Microsoft 365 Premium Training Account Access</w:t>
+      </w:r>
+    </w:p>
+    <w:p>
+      <w:r>
+        <w:t>The trainer assigns each learner a Microsoft 365 Premium training account through a private credential card or channel. Usernames and passwords are intentionally not printed in this guide, the slide deck or the public learner repository.</w:t>
+      </w:r>
+    </w:p>
+    <w:p>
+      <w:pPr>
+        <w:pStyle w:val="ListBullet"/>
+      </w:pPr>
+      <w:r>
+        <w:t>Obtain your assigned account from the trainer, then open https://m365.cloud.microsoft/</w:t>
+      </w:r>
+    </w:p>
+    <w:p>
+      <w:pPr>
+        <w:pStyle w:val="ListBullet"/>
+      </w:pPr>
+      <w:r>
+        <w:t>Sign in with only the account allocated to you and use approved or synthetic activity data.</w:t>
+      </w:r>
+    </w:p>
+    <w:p>
+      <w:pPr>
+        <w:pStyle w:val="ListBullet"/>
+      </w:pPr>
+      <w:r>
+        <w:t>Open Microsoft 365 Copilot, choose Create, select Design an infographic, and enter the prompt from your activity folder.</w:t>
+      </w:r>
+    </w:p>
+    <w:p>
+      <w:pPr>
+        <w:pStyle w:val="ListBullet"/>
+      </w:pPr>
+      <w:r>
+        <w:t>Download and verify your infographic or PowerPoint working file using the activity naming convention.</w:t>
+      </w:r>
+    </w:p>
+    <w:p>
+      <w:pPr>
+        <w:pStyle w:val="ListBullet"/>
+      </w:pPr>
+      <w:r>
+        <w:t>Never change the shared account password, recovery email, security information or multi-factor authentication settings; never share the credentials.</w:t>
+      </w:r>
+    </w:p>
+    <w:p>
+      <w:pPr>
+        <w:pStyle w:val="ListBullet"/>
+      </w:pPr>
+      <w:r>
+        <w:t>When finished, sign out of Microsoft 365 and close the browser. If the infographic option is unavailable, inform the trainer and use the supplied editable PowerPoint starter.</w:t>
       </w:r>
     </w:p>
     <w:p>
@@ -3115,7 +3254,7 @@
         <w:pStyle w:val="ListBullet"/>
       </w:pPr>
       <w:r>
-        <w:t>Chronology, timeline, process, comparison, statistical, mind-map, numerical and hierarchical formats answer different questions.</w:t>
+        <w:t>Chronology, timeline, process, comparison, statistical, mind map, numerical and hierarchical formats answer different questions.</w:t>
       </w:r>
     </w:p>
     <w:p>

</xml_diff>